<commit_message>
pdf file of review article added
</commit_message>
<xml_diff>
--- a/research methods/term project - review article/IEEE_TwoColumn_Jawwad_Ahmad.docx
+++ b/research methods/term project - review article/IEEE_TwoColumn_Jawwad_Ahmad.docx
@@ -95,7 +95,39 @@
           <w:sz w:val="17"/>
           <w:szCs w:val="17"/>
         </w:rPr>
-        <w:t>—The rapid proliferation of Large Language Models (LLMs) such as GPT-4, Llama, Claude, and Google Gemini has intensified the need for reliable automated detection of machine-generated text across high-stakes domains including academia, journalism, and medicine. While transformer-based detection systems have achieved state-of-the-art classification accuracy, their opaque decision-making processes undermine user trust and institutional accountability. This review addresses that limitation by systematically examining the intersection of AI-generated text detection and Explainable Artificial Intelligence (XAI), focusing on the post-hoc local explanation methods LIME (Local Interpretable Model-agnostic Explanations) and SHAP (SHapley Additive exPlanations). Following the PRISMA framework, a systematic search of four electronic databases yielded twelve studies published between 2023 and 2026. Findings are synthesized across three thematic clusters</w:t>
+        <w:t>—The rapid proliferation of Large Language Models (LLMs) such as GPT-4, Llama, Claude, and Google Gemini has intensified the need for reliable automated detection of machine-generated text across high-stakes domains including academia, journalism, and medicine. While transformer-based detection systems have achieved state-of-the-art classification accuracy, their opaque decision-making processes undermine user trust and institutional accountability. This review addresses that limitation by systematically examining the intersection of AI-generated text detection and Explainable Artificial Intelligence (XAI), focusing on the post-hoc local explanation methods LIME (Local Interpretable Model-agnostic Explanations) and SHAP (</w:t>
+      </w:r>
+      <w:proofErr w:type="spellStart"/>
+      <w:r>
+        <w:rPr>
+          <w:sz w:val="17"/>
+          <w:szCs w:val="17"/>
+        </w:rPr>
+        <w:t>SHapley</w:t>
+      </w:r>
+      <w:proofErr w:type="spellEnd"/>
+      <w:r>
+        <w:rPr>
+          <w:sz w:val="17"/>
+          <w:szCs w:val="17"/>
+        </w:rPr>
+        <w:t xml:space="preserve"> Additive </w:t>
+      </w:r>
+      <w:proofErr w:type="spellStart"/>
+      <w:r>
+        <w:rPr>
+          <w:sz w:val="17"/>
+          <w:szCs w:val="17"/>
+        </w:rPr>
+        <w:t>exPlanations</w:t>
+      </w:r>
+      <w:proofErr w:type="spellEnd"/>
+      <w:r>
+        <w:rPr>
+          <w:sz w:val="17"/>
+          <w:szCs w:val="17"/>
+        </w:rPr>
+        <w:t>). Following the PRISMA framework, a systematic search of four electronic databases yielded twelve studies published between 2023 and 2026. Findings are synthesized across three thematic clusters</w:t>
       </w:r>
       <w:r>
         <w:rPr>
@@ -159,12 +191,8 @@
     <w:p>
       <w:pPr>
         <w:sectPr>
-          <w:headerReference w:type="even" r:id="rId8"/>
-          <w:headerReference w:type="default" r:id="rId9"/>
-          <w:footerReference w:type="even" r:id="rId10"/>
-          <w:footerReference w:type="default" r:id="rId11"/>
-          <w:headerReference w:type="first" r:id="rId12"/>
-          <w:footerReference w:type="first" r:id="rId13"/>
+          <w:headerReference w:type="default" r:id="rId8"/>
+          <w:footerReference w:type="default" r:id="rId9"/>
           <w:type w:val="continuous"/>
           <w:pgSz w:w="12240" w:h="15840"/>
           <w:pgMar w:top="1440" w:right="900" w:bottom="1440" w:left="900" w:header="708" w:footer="708" w:gutter="0"/>
@@ -231,7 +259,7 @@
                     <pic:cNvPicPr/>
                   </pic:nvPicPr>
                   <pic:blipFill>
-                    <a:blip r:embed="rId14" cstate="print">
+                    <a:blip r:embed="rId10" cstate="print">
                       <a:extLst>
                         <a:ext uri="{28A0092B-C50C-407E-A947-70E740481C1C}">
                           <a14:useLocalDpi xmlns:a14="http://schemas.microsoft.com/office/drawing/2010/main" val="0"/>
@@ -267,7 +295,23 @@
         </w:drawing>
       </w:r>
       <w:r>
-        <w:t>Early detection systems relied on perplexity scores, burstiness metrics, and stylometric indices. These were rapidly eclipsed by transformer-based architectures such as RoBERTa and DistilBERT, which achieved significantly higher classification accuracy. The HULLMI framework [1] demonstrated that fine-tuned transformers could outperform conventional classifiers across multiple LLM sources and domains. However, improved accuracy has in many ways compounded the underlying challenge.</w:t>
+        <w:t xml:space="preserve">Early detection systems relied on perplexity scores, burstiness metrics, and stylometric indices. These were rapidly eclipsed by transformer-based architectures such as </w:t>
+      </w:r>
+      <w:proofErr w:type="spellStart"/>
+      <w:r>
+        <w:t>RoBERTa</w:t>
+      </w:r>
+      <w:proofErr w:type="spellEnd"/>
+      <w:r>
+        <w:t xml:space="preserve"> and </w:t>
+      </w:r>
+      <w:proofErr w:type="spellStart"/>
+      <w:r>
+        <w:t>DistilBERT</w:t>
+      </w:r>
+      <w:proofErr w:type="spellEnd"/>
+      <w:r>
+        <w:t>, which achieved significantly higher classification accuracy. The HULLMI framework [1] demonstrated that fine-tuned transformers could outperform conventional classifiers across multiple LLM sources and domains. However, improved accuracy has in many ways compounded the underlying challenge.</w:t>
       </w:r>
     </w:p>
     <w:p>
@@ -548,7 +592,23 @@
         </mc:AlternateContent>
       </w:r>
       <w:r>
-        <w:t>Two post-hoc local explanation methods have gained traction: LIME (Local Interpretable Model-agnostic Explanations) [2] and SHAP (SHapley Additive exPlanations) [3]. Both are model-agnostic and provide feature-level attribution, enabling users to understand which linguistic properties drove a classification decision. Studies such as [4] and [5] demonstrate that LIME and SHAP can surface meaningful patterns</w:t>
+        <w:t>Two post-hoc local explanation methods have gained traction: LIME (Local Interpretable Model-agnostic Explanations) [2] and SHAP (</w:t>
+      </w:r>
+      <w:proofErr w:type="spellStart"/>
+      <w:r>
+        <w:t>SHapley</w:t>
+      </w:r>
+      <w:proofErr w:type="spellEnd"/>
+      <w:r>
+        <w:t xml:space="preserve"> Additive </w:t>
+      </w:r>
+      <w:proofErr w:type="spellStart"/>
+      <w:r>
+        <w:t>exPlanations</w:t>
+      </w:r>
+      <w:proofErr w:type="spellEnd"/>
+      <w:r>
+        <w:t>) [3]. Both are model-agnostic and provide feature-level attribution, enabling users to understand which linguistic properties drove a classification decision. Studies such as [4] and [5] demonstrate that LIME and SHAP can surface meaningful patterns</w:t>
       </w:r>
       <w:r>
         <w:t xml:space="preserve"> </w:t>
@@ -653,7 +713,23 @@
         <w:t xml:space="preserve"> </w:t>
       </w:r>
       <w:r>
-        <w:t>fed into SVM or Logistic Regression classifiers. These are interpretable but limited in capturing deep contextual patterns [4], [7]. Transformer-based methods fine-tune models like RoBERTa and DistilBERT for high accuracy but sacrifice interpretability. Multi-label attribution and ensemble methods combine architectures to identify not just whether text is AI-generated, but which LLM produced it [10], [11].</w:t>
+        <w:t xml:space="preserve">fed into SVM or Logistic Regression classifiers. These are interpretable but limited in capturing deep contextual patterns [4], [7]. Transformer-based methods fine-tune models like </w:t>
+      </w:r>
+      <w:proofErr w:type="spellStart"/>
+      <w:r>
+        <w:t>RoBERTa</w:t>
+      </w:r>
+      <w:proofErr w:type="spellEnd"/>
+      <w:r>
+        <w:t xml:space="preserve"> and </w:t>
+      </w:r>
+      <w:proofErr w:type="spellStart"/>
+      <w:r>
+        <w:t>DistilBERT</w:t>
+      </w:r>
+      <w:proofErr w:type="spellEnd"/>
+      <w:r>
+        <w:t xml:space="preserve"> for high accuracy but sacrifice interpretability. Multi-label attribution and ensemble methods combine architectures to identify not just whether text is AI-generated, but which LLM produced it [10], [11].</w:t>
       </w:r>
     </w:p>
     <w:p>
@@ -1170,6 +1246,7 @@
             </w:r>
           </w:p>
           <w:p>
+            <w:proofErr w:type="spellStart"/>
             <w:r>
               <w:rPr>
                 <w:sz w:val="17"/>
@@ -1177,6 +1254,7 @@
               </w:rPr>
               <w:t>Multimodel</w:t>
             </w:r>
+            <w:proofErr w:type="spellEnd"/>
           </w:p>
         </w:tc>
         <w:tc>
@@ -1632,7 +1710,7 @@
                     <pic:cNvPicPr/>
                   </pic:nvPicPr>
                   <pic:blipFill>
-                    <a:blip r:embed="rId15" cstate="print">
+                    <a:blip r:embed="rId11" cstate="print">
                       <a:extLst>
                         <a:ext uri="{28A0092B-C50C-407E-A947-70E740481C1C}">
                           <a14:useLocalDpi xmlns:a14="http://schemas.microsoft.com/office/drawing/2010/main" val="0"/>
@@ -1744,7 +1822,27 @@
           <w:i/>
           <w:iCs/>
         </w:rPr>
-        <w:t xml:space="preserve"> SHapley Additive Explanations</w:t>
+        <w:t xml:space="preserve"> </w:t>
+      </w:r>
+      <w:proofErr w:type="spellStart"/>
+      <w:r>
+        <w:rPr>
+          <w:b/>
+          <w:bCs/>
+          <w:i/>
+          <w:iCs/>
+        </w:rPr>
+        <w:t>SHapley</w:t>
+      </w:r>
+      <w:proofErr w:type="spellEnd"/>
+      <w:r>
+        <w:rPr>
+          <w:b/>
+          <w:bCs/>
+          <w:i/>
+          <w:iCs/>
+        </w:rPr>
+        <w:t xml:space="preserve"> Additive Explanations</w:t>
       </w:r>
     </w:p>
     <w:p>
@@ -1856,7 +1954,23 @@
         <w:jc w:val="both"/>
       </w:pPr>
       <w:r>
-        <w:t>Four electronic databases were systematically searched: Google Scholar, ArXiv, IEEE Xplore, and SciSpace. Primary search strings included: "LLM text detection" AND "explainable AI"; "human vs AI text" AND "LIME OR SHAP"; "AI-generated text detection" AND "interpretability"; "transformer text classification" AND "feature attribution"; and "stylometry" AND "LLM detection".</w:t>
+        <w:t xml:space="preserve">Four electronic databases were systematically searched: Google Scholar, </w:t>
+      </w:r>
+      <w:proofErr w:type="spellStart"/>
+      <w:r>
+        <w:t>ArXiv</w:t>
+      </w:r>
+      <w:proofErr w:type="spellEnd"/>
+      <w:r>
+        <w:t xml:space="preserve">, IEEE Xplore, and </w:t>
+      </w:r>
+      <w:proofErr w:type="spellStart"/>
+      <w:r>
+        <w:t>SciSpace</w:t>
+      </w:r>
+      <w:proofErr w:type="spellEnd"/>
+      <w:r>
+        <w:t>. Primary search strings included: "LLM text detection" AND "explainable AI"; "human vs AI text" AND "LIME OR SHAP"; "AI-generated text detection" AND "interpretability"; "transformer text classification" AND "feature attribution"; and "stylometry" AND "LLM detection".</w:t>
       </w:r>
     </w:p>
     <w:p>
@@ -1906,7 +2020,23 @@
         <w:jc w:val="both"/>
       </w:pPr>
       <w:r>
-        <w:t>The selection pipeline proceeded as follows: 250 records identified across four databases (Google Scholar: 120; ArXiv: 72; IEEE Xplore: 38; SciSpace: 20). After removing 68 duplicates, 182 records were screened; 126 excluded at title/abstract stage. Of 56 full-texts assessed, 44 were excluded: no formal XAI method (n=18), dataset below 500 samples (n=12), non-English text (n=8), no standard evaluation metric (n=6). Twelve studies included in the final synthesis.</w:t>
+        <w:t xml:space="preserve">The selection pipeline proceeded as follows: 250 records identified across four databases (Google Scholar: 120; </w:t>
+      </w:r>
+      <w:proofErr w:type="spellStart"/>
+      <w:r>
+        <w:t>ArXiv</w:t>
+      </w:r>
+      <w:proofErr w:type="spellEnd"/>
+      <w:r>
+        <w:t xml:space="preserve">: 72; IEEE Xplore: 38; </w:t>
+      </w:r>
+      <w:proofErr w:type="spellStart"/>
+      <w:r>
+        <w:t>SciSpace</w:t>
+      </w:r>
+      <w:proofErr w:type="spellEnd"/>
+      <w:r>
+        <w:t>: 20). After removing 68 duplicates, 182 records were screened; 126 excluded at title/abstract stage. Of 56 full-texts assessed, 44 were excluded: no formal XAI method (n=18), dataset below 500 samples (n=12), non-English text (n=8), no standard evaluation metric (n=6). Twelve studies included in the final synthesis.</w:t>
       </w:r>
     </w:p>
     <w:p>
@@ -1935,7 +2065,7 @@
                     <pic:cNvPicPr/>
                   </pic:nvPicPr>
                   <pic:blipFill>
-                    <a:blip r:embed="rId16" cstate="print">
+                    <a:blip r:embed="rId12" cstate="print">
                       <a:extLst>
                         <a:ext uri="{28A0092B-C50C-407E-A947-70E740481C1C}">
                           <a14:useLocalDpi xmlns:a14="http://schemas.microsoft.com/office/drawing/2010/main" val="0"/>
@@ -2187,7 +2317,15 @@
         <w:t xml:space="preserve"> </w:t>
       </w:r>
       <w:r>
-        <w:t>combined with conventional classifiers. Three studies fall within this cluster: Shah et al. [4], McGovern et al. [7], and Przystalski et al. [8].</w:t>
+        <w:t xml:space="preserve">combined with conventional classifiers. Three studies fall within this cluster: Shah et al. [4], McGovern et al. [7], and </w:t>
+      </w:r>
+      <w:proofErr w:type="spellStart"/>
+      <w:r>
+        <w:t>Przystalski</w:t>
+      </w:r>
+      <w:proofErr w:type="spellEnd"/>
+      <w:r>
+        <w:t xml:space="preserve"> et al. [8].</w:t>
       </w:r>
     </w:p>
     <w:p>
@@ -2219,8 +2357,13 @@
         <w:spacing w:after="60"/>
         <w:jc w:val="both"/>
       </w:pPr>
-      <w:r>
-        <w:t>Przystalski et al. [8] address short text samples (fewer than 200 words). SHAP global importance rankings identify three dominant features: grammatical standardization, atypical word frequency distributions, and lexical entropy. Grammatical standardization accounts for nearly twice the predictive weight of the next most important feature</w:t>
+      <w:proofErr w:type="spellStart"/>
+      <w:r>
+        <w:t>Przystalski</w:t>
+      </w:r>
+      <w:proofErr w:type="spellEnd"/>
+      <w:r>
+        <w:t xml:space="preserve"> et al. [8] address short text samples (fewer than 200 words). SHAP global importance rankings identify three dominant features: grammatical standardization, atypical word frequency distributions, and lexical entropy. Grammatical standardization accounts for nearly twice the predictive weight of the next most important feature</w:t>
       </w:r>
       <w:r>
         <w:t xml:space="preserve"> </w:t>
@@ -2255,7 +2398,7 @@
                     <pic:cNvPicPr/>
                   </pic:nvPicPr>
                   <pic:blipFill>
-                    <a:blip r:embed="rId17" cstate="print">
+                    <a:blip r:embed="rId13" cstate="print">
                       <a:extLst>
                         <a:ext uri="{28A0092B-C50C-407E-A947-70E740481C1C}">
                           <a14:useLocalDpi xmlns:a14="http://schemas.microsoft.com/office/drawing/2010/main" val="0"/>
@@ -2369,14 +2512,32 @@
           <w:sz w:val="16"/>
           <w:szCs w:val="16"/>
         </w:rPr>
-        <w:t xml:space="preserve"> Comparison of the three Theme 1 stylometric studies (Shah et al., 2023; McGovern et al., 2024; Przystalski et al., 2025) across detection method, XAI tool applied, top discriminative features identified, and key shared finding versus unresolved tension</w:t>
-      </w:r>
+        <w:t xml:space="preserve"> Comparison of the three Theme 1 stylometric studies (Shah et al., 2023; McGovern et al., 2024; </w:t>
+      </w:r>
+      <w:proofErr w:type="spellStart"/>
       <w:r>
         <w:rPr>
           <w:color w:val="auto"/>
           <w:sz w:val="16"/>
           <w:szCs w:val="16"/>
         </w:rPr>
+        <w:t>Przystalski</w:t>
+      </w:r>
+      <w:proofErr w:type="spellEnd"/>
+      <w:r>
+        <w:rPr>
+          <w:color w:val="auto"/>
+          <w:sz w:val="16"/>
+          <w:szCs w:val="16"/>
+        </w:rPr>
+        <w:t xml:space="preserve"> et al., 2025) across detection method, XAI tool applied, top discriminative features identified, and key shared finding versus unresolved tension</w:t>
+      </w:r>
+      <w:r>
+        <w:rPr>
+          <w:color w:val="auto"/>
+          <w:sz w:val="16"/>
+          <w:szCs w:val="16"/>
+        </w:rPr>
         <w:t>.</w:t>
       </w:r>
     </w:p>
@@ -2409,7 +2570,15 @@
         <w:jc w:val="both"/>
       </w:pPr>
       <w:r>
-        <w:t>Mitrovic et al. [12] fine-tune DistilBERT on a balanced dataset of human-written and ChatGPT-generated short reviews (~50</w:t>
+        <w:t xml:space="preserve">Mitrovic et al. [12] fine-tune </w:t>
+      </w:r>
+      <w:proofErr w:type="spellStart"/>
+      <w:r>
+        <w:t>DistilBERT</w:t>
+      </w:r>
+      <w:proofErr w:type="spellEnd"/>
+      <w:r>
+        <w:t xml:space="preserve"> on a balanced dataset of human-written and ChatGPT-generated short reviews (~50</w:t>
       </w:r>
       <w:r>
         <w:t xml:space="preserve"> - </w:t>
@@ -2428,7 +2597,15 @@
         <w:jc w:val="both"/>
       </w:pPr>
       <w:r>
-        <w:t>The HULLMI framework [1] is the most architecturally comprehensive study in this review. RoBERTa-Sentinel achieves ~91% classification accuracy across all evaluated conditions. Integrating LIME into this pipeline does not degrade performance but adds token-level transparency. LIME explanations reveal that the model's highest-confidence predictions are driven by formulaic hedging language, impersonal constructions, and overly smooth discourse transitions—rather than spurious correlations or dataset artifacts. This positions explainability as a complement to accuracy rather than a trade-off. Accuracy varies considerably across LLMs: models trained primarily on GPT-generated text show 8</w:t>
+        <w:t xml:space="preserve">The HULLMI framework [1] is the most architecturally comprehensive study in this review. </w:t>
+      </w:r>
+      <w:proofErr w:type="spellStart"/>
+      <w:r>
+        <w:t>RoBERTa</w:t>
+      </w:r>
+      <w:proofErr w:type="spellEnd"/>
+      <w:r>
+        <w:t>-Sentinel achieves ~91% classification accuracy across all evaluated conditions. Integrating LIME into this pipeline does not degrade performance but adds token-level transparency. LIME explanations reveal that the model's highest-confidence predictions are driven by formulaic hedging language, impersonal constructions, and overly smooth discourse transitions—rather than spurious correlations or dataset artifacts. This positions explainability as a complement to accuracy rather than a trade-off. Accuracy varies considerably across LLMs: models trained primarily on GPT-generated text show 8</w:t>
       </w:r>
       <w:r>
         <w:t>-</w:t>
@@ -2443,7 +2620,15 @@
         <w:jc w:val="both"/>
       </w:pPr>
       <w:r>
-        <w:t>Masih et al. [5] provide the most comprehensive side-by-side comparison of LIME and SHAP applied to transformer-based text detection, covering BERT, RoBERTa, and a fine-tuned GPT-2 classifier on a mixed corpus. SHAP produces more stable and reproducible explanations than LIME. Both methods can expose cases where a model is correct for the wrong reasons</w:t>
+        <w:t xml:space="preserve">Masih et al. [5] provide the most comprehensive side-by-side comparison of LIME and SHAP applied to transformer-based text detection, covering BERT, </w:t>
+      </w:r>
+      <w:proofErr w:type="spellStart"/>
+      <w:r>
+        <w:t>RoBERTa</w:t>
+      </w:r>
+      <w:proofErr w:type="spellEnd"/>
+      <w:r>
+        <w:t>, and a fine-tuned GPT-2 classifier on a mixed corpus. SHAP produces more stable and reproducible explanations than LIME. Both methods can expose cases where a model is correct for the wrong reasons</w:t>
       </w:r>
       <w:r>
         <w:t xml:space="preserve"> </w:t>
@@ -2773,7 +2958,7 @@
                     </pic:cNvPicPr>
                   </pic:nvPicPr>
                   <pic:blipFill rotWithShape="1">
-                    <a:blip r:embed="rId18" cstate="print">
+                    <a:blip r:embed="rId14" cstate="print">
                       <a:extLst>
                         <a:ext uri="{28A0092B-C50C-407E-A947-70E740481C1C}">
                           <a14:useLocalDpi xmlns:a14="http://schemas.microsoft.com/office/drawing/2010/main" val="0"/>
@@ -2849,8 +3034,13 @@
         <w:spacing w:after="60"/>
         <w:jc w:val="both"/>
       </w:pPr>
-      <w:r>
-        <w:t>Adilazuarda et al. [10] conduct a systematic comparative analysis across multiple benchmark datasets including multilingual corpora. No single paradigm consistently dominates across domains and languages. Transformer-based methods lead in accuracy on single-domain benchmarks, but their advantage narrows or reverses on cross-domain and multilingual datasets. Stylometric methods generalize more stably across domains.</w:t>
+      <w:proofErr w:type="spellStart"/>
+      <w:r>
+        <w:t>Adilazuarda</w:t>
+      </w:r>
+      <w:proofErr w:type="spellEnd"/>
+      <w:r>
+        <w:t xml:space="preserve"> et al. [10] conduct a systematic comparative analysis across multiple benchmark datasets including multilingual corpora. No single paradigm consistently dominates across domains and languages. Transformer-based methods lead in accuracy on single-domain benchmarks, but their advantage narrows or reverses on cross-domain and multilingual datasets. Stylometric methods generalize more stably across domains.</w:t>
       </w:r>
     </w:p>
     <w:p>
@@ -2876,8 +3066,13 @@
         <w:spacing w:after="60"/>
         <w:jc w:val="both"/>
       </w:pPr>
-      <w:r>
-        <w:t>Baharifar et al. [14] address LLM-generated medical misinformation detection. SHAP attributions reveal that such misinformation is most reliably distinguished by overuse of confident assertive constructions, avoidance of appropriate epistemic hedging ("may", "suggests", "is consistent with"), and tendency to state statistical claims without numerical precision or source attribution characteristic of genuine clinical literature.</w:t>
+      <w:proofErr w:type="spellStart"/>
+      <w:r>
+        <w:t>Baharifar</w:t>
+      </w:r>
+      <w:proofErr w:type="spellEnd"/>
+      <w:r>
+        <w:t xml:space="preserve"> et al. [14] address LLM-generated medical misinformation detection. SHAP attributions reveal that such misinformation is most reliably distinguished by overuse of confident assertive constructions, avoidance of appropriate epistemic hedging ("may", "suggests", "is consistent with"), and tendency to state statistical claims without numerical precision or source attribution characteristic of genuine clinical literature.</w:t>
       </w:r>
     </w:p>
     <w:p>
@@ -3023,7 +3218,43 @@
                                 <w:sz w:val="16"/>
                                 <w:szCs w:val="16"/>
                               </w:rPr>
-                              <w:t xml:space="preserve"> Theme 3 progression from binary detection (Adilazuarda et al., 2023) toward multi-LLM attribution (Najjar et al., 2025; Zahraa et al., 2025), domain-specific detection (Baharifar et al., 2025), and scalable source identification (Iqbal &amp; Kashem, 2025)</w:t>
+                              <w:t xml:space="preserve"> Theme 3 progression from binary detection (</w:t>
+                            </w:r>
+                            <w:proofErr w:type="spellStart"/>
+                            <w:r>
+                              <w:rPr>
+                                <w:color w:val="auto"/>
+                                <w:sz w:val="16"/>
+                                <w:szCs w:val="16"/>
+                              </w:rPr>
+                              <w:t>Adilazuarda</w:t>
+                            </w:r>
+                            <w:proofErr w:type="spellEnd"/>
+                            <w:r>
+                              <w:rPr>
+                                <w:color w:val="auto"/>
+                                <w:sz w:val="16"/>
+                                <w:szCs w:val="16"/>
+                              </w:rPr>
+                              <w:t xml:space="preserve"> et al., 2023) toward multi-LLM attribution (Najjar et al., 2025; Zahraa et al., 2025), domain-specific detection (</w:t>
+                            </w:r>
+                            <w:proofErr w:type="spellStart"/>
+                            <w:r>
+                              <w:rPr>
+                                <w:color w:val="auto"/>
+                                <w:sz w:val="16"/>
+                                <w:szCs w:val="16"/>
+                              </w:rPr>
+                              <w:t>Baharifar</w:t>
+                            </w:r>
+                            <w:proofErr w:type="spellEnd"/>
+                            <w:r>
+                              <w:rPr>
+                                <w:color w:val="auto"/>
+                                <w:sz w:val="16"/>
+                                <w:szCs w:val="16"/>
+                              </w:rPr>
+                              <w:t xml:space="preserve"> et al., 2025), and scalable source identification (Iqbal &amp; Kashem, 2025)</w:t>
                             </w:r>
                           </w:p>
                         </w:txbxContent>
@@ -3133,7 +3364,43 @@
                           <w:sz w:val="16"/>
                           <w:szCs w:val="16"/>
                         </w:rPr>
-                        <w:t xml:space="preserve"> Theme 3 progression from binary detection (Adilazuarda et al., 2023) toward multi-LLM attribution (Najjar et al., 2025; Zahraa et al., 2025), domain-specific detection (Baharifar et al., 2025), and scalable source identification (Iqbal &amp; Kashem, 2025)</w:t>
+                        <w:t xml:space="preserve"> Theme 3 progression from binary detection (</w:t>
+                      </w:r>
+                      <w:proofErr w:type="spellStart"/>
+                      <w:r>
+                        <w:rPr>
+                          <w:color w:val="auto"/>
+                          <w:sz w:val="16"/>
+                          <w:szCs w:val="16"/>
+                        </w:rPr>
+                        <w:t>Adilazuarda</w:t>
+                      </w:r>
+                      <w:proofErr w:type="spellEnd"/>
+                      <w:r>
+                        <w:rPr>
+                          <w:color w:val="auto"/>
+                          <w:sz w:val="16"/>
+                          <w:szCs w:val="16"/>
+                        </w:rPr>
+                        <w:t xml:space="preserve"> et al., 2023) toward multi-LLM attribution (Najjar et al., 2025; Zahraa et al., 2025), domain-specific detection (</w:t>
+                      </w:r>
+                      <w:proofErr w:type="spellStart"/>
+                      <w:r>
+                        <w:rPr>
+                          <w:color w:val="auto"/>
+                          <w:sz w:val="16"/>
+                          <w:szCs w:val="16"/>
+                        </w:rPr>
+                        <w:t>Baharifar</w:t>
+                      </w:r>
+                      <w:proofErr w:type="spellEnd"/>
+                      <w:r>
+                        <w:rPr>
+                          <w:color w:val="auto"/>
+                          <w:sz w:val="16"/>
+                          <w:szCs w:val="16"/>
+                        </w:rPr>
+                        <w:t xml:space="preserve"> et al., 2025), and scalable source identification (Iqbal &amp; Kashem, 2025)</w:t>
                       </w:r>
                     </w:p>
                   </w:txbxContent>
@@ -3174,7 +3441,7 @@
                     </pic:cNvPicPr>
                   </pic:nvPicPr>
                   <pic:blipFill>
-                    <a:blip r:embed="rId19" cstate="print">
+                    <a:blip r:embed="rId15" cstate="print">
                       <a:extLst>
                         <a:ext uri="{28A0092B-C50C-407E-A947-70E740481C1C}">
                           <a14:useLocalDpi xmlns:a14="http://schemas.microsoft.com/office/drawing/2010/main" val="0"/>
@@ -3290,7 +3557,15 @@
         <w:t>-</w:t>
       </w:r>
       <w:r>
-        <w:t>87% range. Transformer-based approaches [1], [5], [12], [13] achieve peak accuracy (~91% for RoBERTa-Sentinel) but their interpretability deficit is recoverable through LIME and SHAP integration without accuracy sacrifice. Multi-label attribution frameworks [6], [9], [10], [11], [14] produce the richest output at the highest computational cost. No paradigm dominates across all four dimensions of accuracy, interpretability, generalizability, and adversarial robustness.</w:t>
+        <w:t xml:space="preserve">87% range. Transformer-based approaches [1], [5], [12], [13] achieve peak accuracy (~91% for </w:t>
+      </w:r>
+      <w:proofErr w:type="spellStart"/>
+      <w:r>
+        <w:t>RoBERTa</w:t>
+      </w:r>
+      <w:proofErr w:type="spellEnd"/>
+      <w:r>
+        <w:t>-Sentinel) but their interpretability deficit is recoverable through LIME and SHAP integration without accuracy sacrifice. Multi-label attribution frameworks [6], [9], [10], [11], [14] produce the richest output at the highest computational cost. No paradigm dominates across all four dimensions of accuracy, interpretability, generalizability, and adversarial robustness.</w:t>
       </w:r>
     </w:p>
     <w:p>
@@ -3601,7 +3876,7 @@
                     </pic:cNvPicPr>
                   </pic:nvPicPr>
                   <pic:blipFill rotWithShape="1">
-                    <a:blip r:embed="rId20" cstate="print">
+                    <a:blip r:embed="rId16" cstate="print">
                       <a:extLst>
                         <a:ext uri="{28A0092B-C50C-407E-A947-70E740481C1C}">
                           <a14:useLocalDpi xmlns:a14="http://schemas.microsoft.com/office/drawing/2010/main" val="0"/>
@@ -3986,7 +4261,7 @@
                     </pic:cNvPicPr>
                   </pic:nvPicPr>
                   <pic:blipFill rotWithShape="1">
-                    <a:blip r:embed="rId21" cstate="print">
+                    <a:blip r:embed="rId17" cstate="print">
                       <a:extLst>
                         <a:ext uri="{28A0092B-C50C-407E-A947-70E740481C1C}">
                           <a14:useLocalDpi xmlns:a14="http://schemas.microsoft.com/office/drawing/2010/main" val="0"/>
@@ -5121,7 +5396,25 @@
           <w:i/>
           <w:iCs/>
         </w:rPr>
-        <w:t>B. Gap 2: Standardized XAI Evaluation Benchmarks</w:t>
+        <w:t xml:space="preserve">B. Gap 2: </w:t>
+      </w:r>
+      <w:r>
+        <w:rPr>
+          <w:b/>
+          <w:bCs/>
+          <w:i/>
+          <w:iCs/>
+        </w:rPr>
+        <w:t xml:space="preserve">Absence of </w:t>
+      </w:r>
+      <w:r>
+        <w:rPr>
+          <w:b/>
+          <w:bCs/>
+          <w:i/>
+          <w:iCs/>
+        </w:rPr>
+        <w:t>Standardized XAI Evaluation Benchmarks</w:t>
       </w:r>
     </w:p>
     <w:p>
@@ -5130,7 +5423,15 @@
         <w:jc w:val="both"/>
       </w:pPr>
       <w:r>
-        <w:t>The field lacks shared protocols for assessing XAI faithfulness, stability, and interpretability. The most impactful single contribution would be the development of a shared XAI evaluation protocol for AGTD, analogous to the role GLUE and SuperGLUE play in general NLP. Such a protocol should include automated faithfulness metrics, stability metrics, and human evaluation studies.</w:t>
+        <w:t xml:space="preserve">The field lacks shared protocols for assessing XAI faithfulness, stability, and interpretability. The most impactful single contribution would be the development of a shared XAI evaluation protocol for AGTD, analogous to the role GLUE and </w:t>
+      </w:r>
+      <w:proofErr w:type="spellStart"/>
+      <w:r>
+        <w:t>SuperGLUE</w:t>
+      </w:r>
+      <w:proofErr w:type="spellEnd"/>
+      <w:r>
+        <w:t xml:space="preserve"> play in general NLP. Such a protocol should include automated faithfulness metrics, stability metrics, and human evaluation studies.</w:t>
       </w:r>
     </w:p>
     <w:p>
@@ -5205,7 +5506,23 @@
         <w:jc w:val="both"/>
       </w:pPr>
       <w:r>
-        <w:t>None of the twelve reviewed studies applies formal XAI methods to non-English text. Future work should develop multilingual explainable detection benchmarks across typologically diverse languages. The application of LIME and SHAP to multilingual transformer models such as mBERT and XLM-RoBERTa would provide the first systematic characterization of cross-lingual XAI attribution in AGTD.</w:t>
+        <w:t xml:space="preserve">None of the twelve reviewed studies applies formal XAI methods to non-English text. Future work should develop multilingual explainable detection benchmarks across typologically diverse languages. The application of LIME and SHAP to multilingual transformer models such as </w:t>
+      </w:r>
+      <w:proofErr w:type="spellStart"/>
+      <w:r>
+        <w:t>mBERT</w:t>
+      </w:r>
+      <w:proofErr w:type="spellEnd"/>
+      <w:r>
+        <w:t xml:space="preserve"> and XLM-</w:t>
+      </w:r>
+      <w:proofErr w:type="spellStart"/>
+      <w:r>
+        <w:t>RoBERTa</w:t>
+      </w:r>
+      <w:proofErr w:type="spellEnd"/>
+      <w:r>
+        <w:t xml:space="preserve"> would provide the first systematic characterization of cross-lingual XAI attribution in AGTD.</w:t>
       </w:r>
     </w:p>
     <w:p>
@@ -5299,7 +5616,39 @@
           <w:sz w:val="17"/>
           <w:szCs w:val="17"/>
         </w:rPr>
-        <w:t>[1]  P. D. Joshi, S. Pocker, R. A. Dandekar, and S. Panat, "HULLMI: Human vs LLM identification with explainability," arXiv preprint arXiv:2409.04808, 2024.</w:t>
+        <w:t xml:space="preserve">[1]  P. D. Joshi, S. </w:t>
+      </w:r>
+      <w:proofErr w:type="spellStart"/>
+      <w:r>
+        <w:rPr>
+          <w:sz w:val="17"/>
+          <w:szCs w:val="17"/>
+        </w:rPr>
+        <w:t>Pocker</w:t>
+      </w:r>
+      <w:proofErr w:type="spellEnd"/>
+      <w:r>
+        <w:rPr>
+          <w:sz w:val="17"/>
+          <w:szCs w:val="17"/>
+        </w:rPr>
+        <w:t xml:space="preserve">, R. A. Dandekar, and S. Panat, "HULLMI: Human vs LLM identification with explainability," </w:t>
+      </w:r>
+      <w:proofErr w:type="spellStart"/>
+      <w:r>
+        <w:rPr>
+          <w:sz w:val="17"/>
+          <w:szCs w:val="17"/>
+        </w:rPr>
+        <w:t>arXiv</w:t>
+      </w:r>
+      <w:proofErr w:type="spellEnd"/>
+      <w:r>
+        <w:rPr>
+          <w:sz w:val="17"/>
+          <w:szCs w:val="17"/>
+        </w:rPr>
+        <w:t xml:space="preserve"> preprint arXiv:2409.04808, 2024.</w:t>
       </w:r>
     </w:p>
     <w:p>
@@ -5313,7 +5662,23 @@
           <w:sz w:val="17"/>
           <w:szCs w:val="17"/>
         </w:rPr>
-        <w:t>[2]  M. T. Ribeiro, S. Singh, and C. Guestrin, "'Why Should I Trust You?': Explaining the predictions of any classifier," in Proc. 22nd ACM SIGKDD Conf. Knowledge Discovery and Data Mining, 2016.</w:t>
+        <w:t xml:space="preserve">[2]  M. T. Ribeiro, S. Singh, and C. </w:t>
+      </w:r>
+      <w:proofErr w:type="spellStart"/>
+      <w:r>
+        <w:rPr>
+          <w:sz w:val="17"/>
+          <w:szCs w:val="17"/>
+        </w:rPr>
+        <w:t>Guestrin</w:t>
+      </w:r>
+      <w:proofErr w:type="spellEnd"/>
+      <w:r>
+        <w:rPr>
+          <w:sz w:val="17"/>
+          <w:szCs w:val="17"/>
+        </w:rPr>
+        <w:t>, "'Why Should I Trust You?': Explaining the predictions of any classifier," in Proc. 22nd ACM SIGKDD Conf. Knowledge Discovery and Data Mining, 2016.</w:t>
       </w:r>
     </w:p>
     <w:p>
@@ -5327,7 +5692,23 @@
           <w:sz w:val="17"/>
           <w:szCs w:val="17"/>
         </w:rPr>
-        <w:t>[3]  S. M. Lundberg and S.-I. Lee, "A unified approach to interpreting model predictions," in Proc. Neural Information Processing Systems (NeurIPS), 2017.</w:t>
+        <w:t>[3]  S. M. Lundberg and S.-I. Lee, "A unified approach to interpreting model predictions," in Proc. Neural Information Processing Systems (</w:t>
+      </w:r>
+      <w:proofErr w:type="spellStart"/>
+      <w:r>
+        <w:rPr>
+          <w:sz w:val="17"/>
+          <w:szCs w:val="17"/>
+        </w:rPr>
+        <w:t>NeurIPS</w:t>
+      </w:r>
+      <w:proofErr w:type="spellEnd"/>
+      <w:r>
+        <w:rPr>
+          <w:sz w:val="17"/>
+          <w:szCs w:val="17"/>
+        </w:rPr>
+        <w:t>), 2017.</w:t>
       </w:r>
     </w:p>
     <w:p>
@@ -5383,7 +5764,71 @@
           <w:sz w:val="17"/>
           <w:szCs w:val="17"/>
         </w:rPr>
-        <w:t>[7]  H. McGovern, R. Stureborg, Y. Suhara, and D. Alikaniotis, "Your large language models are leaving fingerprints," arXiv preprint arXiv:2405.14057, 2024.</w:t>
+        <w:t xml:space="preserve">[7]  H. McGovern, R. </w:t>
+      </w:r>
+      <w:proofErr w:type="spellStart"/>
+      <w:r>
+        <w:rPr>
+          <w:sz w:val="17"/>
+          <w:szCs w:val="17"/>
+        </w:rPr>
+        <w:t>Stureborg</w:t>
+      </w:r>
+      <w:proofErr w:type="spellEnd"/>
+      <w:r>
+        <w:rPr>
+          <w:sz w:val="17"/>
+          <w:szCs w:val="17"/>
+        </w:rPr>
+        <w:t xml:space="preserve">, Y. </w:t>
+      </w:r>
+      <w:proofErr w:type="spellStart"/>
+      <w:r>
+        <w:rPr>
+          <w:sz w:val="17"/>
+          <w:szCs w:val="17"/>
+        </w:rPr>
+        <w:t>Suhara</w:t>
+      </w:r>
+      <w:proofErr w:type="spellEnd"/>
+      <w:r>
+        <w:rPr>
+          <w:sz w:val="17"/>
+          <w:szCs w:val="17"/>
+        </w:rPr>
+        <w:t xml:space="preserve">, and D. </w:t>
+      </w:r>
+      <w:proofErr w:type="spellStart"/>
+      <w:r>
+        <w:rPr>
+          <w:sz w:val="17"/>
+          <w:szCs w:val="17"/>
+        </w:rPr>
+        <w:t>Alikaniotis</w:t>
+      </w:r>
+      <w:proofErr w:type="spellEnd"/>
+      <w:r>
+        <w:rPr>
+          <w:sz w:val="17"/>
+          <w:szCs w:val="17"/>
+        </w:rPr>
+        <w:t xml:space="preserve">, "Your large language models are leaving fingerprints," </w:t>
+      </w:r>
+      <w:proofErr w:type="spellStart"/>
+      <w:r>
+        <w:rPr>
+          <w:sz w:val="17"/>
+          <w:szCs w:val="17"/>
+        </w:rPr>
+        <w:t>arXiv</w:t>
+      </w:r>
+      <w:proofErr w:type="spellEnd"/>
+      <w:r>
+        <w:rPr>
+          <w:sz w:val="17"/>
+          <w:szCs w:val="17"/>
+        </w:rPr>
+        <w:t xml:space="preserve"> preprint arXiv:2405.14057, 2024.</w:t>
       </w:r>
     </w:p>
     <w:p>
@@ -5397,7 +5842,55 @@
           <w:sz w:val="17"/>
           <w:szCs w:val="17"/>
         </w:rPr>
-        <w:t>[8]  K. Przystalski, J. K. Argasiński, I. Grabska-Gradzińska, and J. Ochab, "Stylometry recognizes human and LLM-generated texts in short samples," Expert Systems with Applications, p. 129001, 2025.</w:t>
+        <w:t xml:space="preserve">[8]  K. </w:t>
+      </w:r>
+      <w:proofErr w:type="spellStart"/>
+      <w:r>
+        <w:rPr>
+          <w:sz w:val="17"/>
+          <w:szCs w:val="17"/>
+        </w:rPr>
+        <w:t>Przystalski</w:t>
+      </w:r>
+      <w:proofErr w:type="spellEnd"/>
+      <w:r>
+        <w:rPr>
+          <w:sz w:val="17"/>
+          <w:szCs w:val="17"/>
+        </w:rPr>
+        <w:t xml:space="preserve">, J. K. </w:t>
+      </w:r>
+      <w:proofErr w:type="spellStart"/>
+      <w:r>
+        <w:rPr>
+          <w:sz w:val="17"/>
+          <w:szCs w:val="17"/>
+        </w:rPr>
+        <w:t>Argasiński</w:t>
+      </w:r>
+      <w:proofErr w:type="spellEnd"/>
+      <w:r>
+        <w:rPr>
+          <w:sz w:val="17"/>
+          <w:szCs w:val="17"/>
+        </w:rPr>
+        <w:t>, I. Grabska-</w:t>
+      </w:r>
+      <w:proofErr w:type="spellStart"/>
+      <w:r>
+        <w:rPr>
+          <w:sz w:val="17"/>
+          <w:szCs w:val="17"/>
+        </w:rPr>
+        <w:t>Gradzińska</w:t>
+      </w:r>
+      <w:proofErr w:type="spellEnd"/>
+      <w:r>
+        <w:rPr>
+          <w:sz w:val="17"/>
+          <w:szCs w:val="17"/>
+        </w:rPr>
+        <w:t>, and J. Ochab, "Stylometry recognizes human and LLM-generated texts in short samples," Expert Systems with Applications, p. 129001, 2025.</w:t>
       </w:r>
     </w:p>
     <w:p>
@@ -5411,7 +5904,39 @@
           <w:sz w:val="17"/>
           <w:szCs w:val="17"/>
         </w:rPr>
-        <w:t>[9]  Z. J. Mohammed Ali, "Interpretable multi-label classification of human- and LLM-generated texts using transformer embeddings and explainable AI," Ingénierie des Systèmes d'Information, vol. 30, no. 12, 2025.</w:t>
+        <w:t xml:space="preserve">[9]  Z. J. Mohammed Ali, "Interpretable multi-label classification of human- and LLM-generated texts using transformer embeddings and explainable AI," </w:t>
+      </w:r>
+      <w:proofErr w:type="spellStart"/>
+      <w:r>
+        <w:rPr>
+          <w:sz w:val="17"/>
+          <w:szCs w:val="17"/>
+        </w:rPr>
+        <w:t>Ingénierie</w:t>
+      </w:r>
+      <w:proofErr w:type="spellEnd"/>
+      <w:r>
+        <w:rPr>
+          <w:sz w:val="17"/>
+          <w:szCs w:val="17"/>
+        </w:rPr>
+        <w:t xml:space="preserve"> des Systèmes </w:t>
+      </w:r>
+      <w:proofErr w:type="spellStart"/>
+      <w:r>
+        <w:rPr>
+          <w:sz w:val="17"/>
+          <w:szCs w:val="17"/>
+        </w:rPr>
+        <w:t>d'Information</w:t>
+      </w:r>
+      <w:proofErr w:type="spellEnd"/>
+      <w:r>
+        <w:rPr>
+          <w:sz w:val="17"/>
+          <w:szCs w:val="17"/>
+        </w:rPr>
+        <w:t>, vol. 30, no. 12, 2025.</w:t>
       </w:r>
     </w:p>
     <w:p>
@@ -5425,7 +5950,55 @@
           <w:sz w:val="17"/>
           <w:szCs w:val="17"/>
         </w:rPr>
-        <w:t>[10] F. Adilazuarda, N. N. Arkoulis, and O. Chumakov, "Beyond Turing: A comparative analysis of approaches for detecting machine-generated text," arXiv preprint arXiv:2311.12373, 2023.</w:t>
+        <w:t xml:space="preserve">[10] F. </w:t>
+      </w:r>
+      <w:proofErr w:type="spellStart"/>
+      <w:r>
+        <w:rPr>
+          <w:sz w:val="17"/>
+          <w:szCs w:val="17"/>
+        </w:rPr>
+        <w:t>Adilazuarda</w:t>
+      </w:r>
+      <w:proofErr w:type="spellEnd"/>
+      <w:r>
+        <w:rPr>
+          <w:sz w:val="17"/>
+          <w:szCs w:val="17"/>
+        </w:rPr>
+        <w:t xml:space="preserve">, N. N. </w:t>
+      </w:r>
+      <w:proofErr w:type="spellStart"/>
+      <w:r>
+        <w:rPr>
+          <w:sz w:val="17"/>
+          <w:szCs w:val="17"/>
+        </w:rPr>
+        <w:t>Arkoulis</w:t>
+      </w:r>
+      <w:proofErr w:type="spellEnd"/>
+      <w:r>
+        <w:rPr>
+          <w:sz w:val="17"/>
+          <w:szCs w:val="17"/>
+        </w:rPr>
+        <w:t xml:space="preserve">, and O. Chumakov, "Beyond Turing: A comparative analysis of approaches for detecting machine-generated text," </w:t>
+      </w:r>
+      <w:proofErr w:type="spellStart"/>
+      <w:r>
+        <w:rPr>
+          <w:sz w:val="17"/>
+          <w:szCs w:val="17"/>
+        </w:rPr>
+        <w:t>arXiv</w:t>
+      </w:r>
+      <w:proofErr w:type="spellEnd"/>
+      <w:r>
+        <w:rPr>
+          <w:sz w:val="17"/>
+          <w:szCs w:val="17"/>
+        </w:rPr>
+        <w:t xml:space="preserve"> preprint arXiv:2311.12373, 2023.</w:t>
       </w:r>
     </w:p>
     <w:p>
@@ -5453,7 +6026,23 @@
           <w:sz w:val="17"/>
           <w:szCs w:val="17"/>
         </w:rPr>
-        <w:t>[12] S. Mitrovic, D. Andreoletti, and O. Ayoub, "ChatGPT or Human? Detect and explain," arXiv preprint arXiv:2301.13852, 2023.</w:t>
+        <w:t xml:space="preserve">[12] S. Mitrovic, D. Andreoletti, and O. Ayoub, "ChatGPT or Human? Detect and explain," </w:t>
+      </w:r>
+      <w:proofErr w:type="spellStart"/>
+      <w:r>
+        <w:rPr>
+          <w:sz w:val="17"/>
+          <w:szCs w:val="17"/>
+        </w:rPr>
+        <w:t>arXiv</w:t>
+      </w:r>
+      <w:proofErr w:type="spellEnd"/>
+      <w:r>
+        <w:rPr>
+          <w:sz w:val="17"/>
+          <w:szCs w:val="17"/>
+        </w:rPr>
+        <w:t xml:space="preserve"> preprint arXiv:2301.13852, 2023.</w:t>
       </w:r>
     </w:p>
     <w:p>
@@ -5467,7 +6056,23 @@
           <w:sz w:val="17"/>
           <w:szCs w:val="17"/>
         </w:rPr>
-        <w:t>[13] H. Mohammadi, A. Giachanou, D. L. Oberski, and A. Bagheri, "Explainability-based token replacement on LLM-generated text," arXiv preprint arXiv:2506.04050, 2025.</w:t>
+        <w:t xml:space="preserve">[13] H. Mohammadi, A. Giachanou, D. L. Oberski, and A. Bagheri, "Explainability-based token replacement on LLM-generated text," </w:t>
+      </w:r>
+      <w:proofErr w:type="spellStart"/>
+      <w:r>
+        <w:rPr>
+          <w:sz w:val="17"/>
+          <w:szCs w:val="17"/>
+        </w:rPr>
+        <w:t>arXiv</w:t>
+      </w:r>
+      <w:proofErr w:type="spellEnd"/>
+      <w:r>
+        <w:rPr>
+          <w:sz w:val="17"/>
+          <w:szCs w:val="17"/>
+        </w:rPr>
+        <w:t xml:space="preserve"> preprint arXiv:2506.04050, 2025.</w:t>
       </w:r>
     </w:p>
     <w:p>
@@ -5481,12 +6086,28 @@
           <w:sz w:val="17"/>
           <w:szCs w:val="17"/>
         </w:rPr>
-        <w:t>[14] M. Baharifar, A. Kujur, and Z. Monfared, "Interpretable AI for classifying human- and LLM-generated medical misinformation with multi-modal features," 2nd Sorbonne-Heidelberg Workshop on AI in Medicine, 2025.</w:t>
+        <w:t xml:space="preserve">[14] M. </w:t>
+      </w:r>
+      <w:proofErr w:type="spellStart"/>
+      <w:r>
+        <w:rPr>
+          <w:sz w:val="17"/>
+          <w:szCs w:val="17"/>
+        </w:rPr>
+        <w:t>Baharifar</w:t>
+      </w:r>
+      <w:proofErr w:type="spellEnd"/>
+      <w:r>
+        <w:rPr>
+          <w:sz w:val="17"/>
+          <w:szCs w:val="17"/>
+        </w:rPr>
+        <w:t>, A. Kujur, and Z. Monfared, "Interpretable AI for classifying human- and LLM-generated medical misinformation with multi-modal features," 2nd Sorbonne-Heidelberg Workshop on AI in Medicine, 2025.</w:t>
       </w:r>
     </w:p>
     <w:sectPr>
-      <w:headerReference w:type="default" r:id="rId22"/>
-      <w:footerReference w:type="default" r:id="rId23"/>
+      <w:headerReference w:type="default" r:id="rId18"/>
+      <w:footerReference w:type="default" r:id="rId19"/>
       <w:type w:val="continuous"/>
       <w:pgSz w:w="12240" w:h="15840"/>
       <w:pgMar w:top="1440" w:right="900" w:bottom="1440" w:left="900" w:header="708" w:footer="708" w:gutter="0"/>
@@ -5517,16 +6138,6 @@
 </file>
 
 <file path=word/footer1.xml><?xml version="1.0" encoding="utf-8"?>
-<w:ftr xmlns:wpc="http://schemas.microsoft.com/office/word/2010/wordprocessingCanvas" xmlns:cx="http://schemas.microsoft.com/office/drawing/2014/chartex" xmlns:cx1="http://schemas.microsoft.com/office/drawing/2015/9/8/chartex" xmlns:cx2="http://schemas.microsoft.com/office/drawing/2015/10/21/chartex" xmlns:cx3="http://schemas.microsoft.com/office/drawing/2016/5/9/chartex" xmlns:cx4="http://schemas.microsoft.com/office/drawing/2016/5/10/chartex" xmlns:cx5="http://schemas.microsoft.com/office/drawing/2016/5/11/chartex" xmlns:cx6="http://schemas.microsoft.com/office/drawing/2016/5/12/chartex" xmlns:cx7="http://schemas.microsoft.com/office/drawing/2016/5/13/chartex" xmlns:cx8="http://schemas.microsoft.com/office/drawing/2016/5/14/chartex" xmlns:mc="http://schemas.openxmlformats.org/markup-compatibility/2006" xmlns:aink="http://schemas.microsoft.com/office/drawing/2016/ink" xmlns:am3d="http://schemas.microsoft.com/office/drawing/2017/model3d" xmlns:o="urn:schemas-microsoft-com:office:office" xmlns:oel="http://schemas.microsoft.com/office/2019/extlst" xmlns:r="http://schemas.openxmlformats.org/officeDocument/2006/relationships" xmlns:m="http://schemas.openxmlformats.org/officeDocument/2006/math" xmlns:v="urn:schemas-microsoft-com:vml" xmlns:wp14="http://schemas.microsoft.com/office/word/2010/wordprocessingDrawing" xmlns:wp="http://schemas.openxmlformats.org/drawingml/2006/wordprocessingDrawing" xmlns:w10="urn:schemas-microsoft-com:office:word" xmlns:w="http://schemas.openxmlformats.org/wordprocessingml/2006/main" xmlns:w14="http://schemas.microsoft.com/office/word/2010/wordml" xmlns:w15="http://schemas.microsoft.com/office/word/2012/wordml" xmlns:w16cex="http://schemas.microsoft.com/office/word/2018/wordml/cex" xmlns:w16cid="http://schemas.microsoft.com/office/word/2016/wordml/cid" xmlns:w16="http://schemas.microsoft.com/office/word/2018/wordml" xmlns:w16du="http://schemas.microsoft.com/office/word/2023/wordml/word16du" xmlns:w16sdtdh="http://schemas.microsoft.com/office/word/2020/wordml/sdtdatahash" xmlns:w16sdtfl="http://schemas.microsoft.com/office/word/2024/wordml/sdtformatlock" xmlns:w16se="http://schemas.microsoft.com/office/word/2015/wordml/symex" xmlns:wpg="http://schemas.microsoft.com/office/word/2010/wordprocessingGroup" xmlns:wpi="http://schemas.microsoft.com/office/word/2010/wordprocessingInk" xmlns:wne="http://schemas.microsoft.com/office/word/2006/wordml" xmlns:wps="http://schemas.microsoft.com/office/word/2010/wordprocessingShape" mc:Ignorable="w14 w15 w16se w16cid w16 w16cex w16sdtdh w16sdtfl w16du wp14">
-  <w:p>
-    <w:pPr>
-      <w:pStyle w:val="Footer"/>
-    </w:pPr>
-  </w:p>
-</w:ftr>
-</file>
-
-<file path=word/footer2.xml><?xml version="1.0" encoding="utf-8"?>
 <w:ftr xmlns:wpc="http://schemas.microsoft.com/office/word/2010/wordprocessingCanvas" xmlns:cx="http://schemas.microsoft.com/office/drawing/2014/chartex" xmlns:cx1="http://schemas.microsoft.com/office/drawing/2015/9/8/chartex" xmlns:cx2="http://schemas.microsoft.com/office/drawing/2015/10/21/chartex" xmlns:cx3="http://schemas.microsoft.com/office/drawing/2016/5/9/chartex" xmlns:cx4="http://schemas.microsoft.com/office/drawing/2016/5/10/chartex" xmlns:cx5="http://schemas.microsoft.com/office/drawing/2016/5/11/chartex" xmlns:cx6="http://schemas.microsoft.com/office/drawing/2016/5/12/chartex" xmlns:cx7="http://schemas.microsoft.com/office/drawing/2016/5/13/chartex" xmlns:cx8="http://schemas.microsoft.com/office/drawing/2016/5/14/chartex" xmlns:mc="http://schemas.openxmlformats.org/markup-compatibility/2006" xmlns:aink="http://schemas.microsoft.com/office/drawing/2016/ink" xmlns:am3d="http://schemas.microsoft.com/office/drawing/2017/model3d" xmlns:o="urn:schemas-microsoft-com:office:office" xmlns:oel="http://schemas.microsoft.com/office/2019/extlst" xmlns:r="http://schemas.openxmlformats.org/officeDocument/2006/relationships" xmlns:m="http://schemas.openxmlformats.org/officeDocument/2006/math" xmlns:v="urn:schemas-microsoft-com:vml" xmlns:wp14="http://schemas.microsoft.com/office/word/2010/wordprocessingDrawing" xmlns:wp="http://schemas.openxmlformats.org/drawingml/2006/wordprocessingDrawing" xmlns:w10="urn:schemas-microsoft-com:office:word" xmlns:w="http://schemas.openxmlformats.org/wordprocessingml/2006/main" xmlns:w14="http://schemas.microsoft.com/office/word/2010/wordml" xmlns:w15="http://schemas.microsoft.com/office/word/2012/wordml" xmlns:w16cex="http://schemas.microsoft.com/office/word/2018/wordml/cex" xmlns:w16cid="http://schemas.microsoft.com/office/word/2016/wordml/cid" xmlns:w16="http://schemas.microsoft.com/office/word/2018/wordml" xmlns:w16du="http://schemas.microsoft.com/office/word/2023/wordml/word16du" xmlns:w16sdtdh="http://schemas.microsoft.com/office/word/2020/wordml/sdtdatahash" xmlns:w16sdtfl="http://schemas.microsoft.com/office/word/2024/wordml/sdtformatlock" xmlns:w16se="http://schemas.microsoft.com/office/word/2015/wordml/symex" xmlns:wpg="http://schemas.microsoft.com/office/word/2010/wordprocessingGroup" xmlns:wpi="http://schemas.microsoft.com/office/word/2010/wordprocessingInk" xmlns:wne="http://schemas.microsoft.com/office/word/2006/wordml" xmlns:wps="http://schemas.microsoft.com/office/word/2010/wordprocessingShape" mc:Ignorable="w14 w15 w16se w16cid w16 w16cex w16sdtdh w16sdtfl w16du wp14">
   <w:p>
     <w:pPr>
@@ -5582,17 +6193,7 @@
 </w:ftr>
 </file>
 
-<file path=word/footer3.xml><?xml version="1.0" encoding="utf-8"?>
-<w:ftr xmlns:wpc="http://schemas.microsoft.com/office/word/2010/wordprocessingCanvas" xmlns:cx="http://schemas.microsoft.com/office/drawing/2014/chartex" xmlns:cx1="http://schemas.microsoft.com/office/drawing/2015/9/8/chartex" xmlns:cx2="http://schemas.microsoft.com/office/drawing/2015/10/21/chartex" xmlns:cx3="http://schemas.microsoft.com/office/drawing/2016/5/9/chartex" xmlns:cx4="http://schemas.microsoft.com/office/drawing/2016/5/10/chartex" xmlns:cx5="http://schemas.microsoft.com/office/drawing/2016/5/11/chartex" xmlns:cx6="http://schemas.microsoft.com/office/drawing/2016/5/12/chartex" xmlns:cx7="http://schemas.microsoft.com/office/drawing/2016/5/13/chartex" xmlns:cx8="http://schemas.microsoft.com/office/drawing/2016/5/14/chartex" xmlns:mc="http://schemas.openxmlformats.org/markup-compatibility/2006" xmlns:aink="http://schemas.microsoft.com/office/drawing/2016/ink" xmlns:am3d="http://schemas.microsoft.com/office/drawing/2017/model3d" xmlns:o="urn:schemas-microsoft-com:office:office" xmlns:oel="http://schemas.microsoft.com/office/2019/extlst" xmlns:r="http://schemas.openxmlformats.org/officeDocument/2006/relationships" xmlns:m="http://schemas.openxmlformats.org/officeDocument/2006/math" xmlns:v="urn:schemas-microsoft-com:vml" xmlns:wp14="http://schemas.microsoft.com/office/word/2010/wordprocessingDrawing" xmlns:wp="http://schemas.openxmlformats.org/drawingml/2006/wordprocessingDrawing" xmlns:w10="urn:schemas-microsoft-com:office:word" xmlns:w="http://schemas.openxmlformats.org/wordprocessingml/2006/main" xmlns:w14="http://schemas.microsoft.com/office/word/2010/wordml" xmlns:w15="http://schemas.microsoft.com/office/word/2012/wordml" xmlns:w16cex="http://schemas.microsoft.com/office/word/2018/wordml/cex" xmlns:w16cid="http://schemas.microsoft.com/office/word/2016/wordml/cid" xmlns:w16="http://schemas.microsoft.com/office/word/2018/wordml" xmlns:w16du="http://schemas.microsoft.com/office/word/2023/wordml/word16du" xmlns:w16sdtdh="http://schemas.microsoft.com/office/word/2020/wordml/sdtdatahash" xmlns:w16sdtfl="http://schemas.microsoft.com/office/word/2024/wordml/sdtformatlock" xmlns:w16se="http://schemas.microsoft.com/office/word/2015/wordml/symex" xmlns:wpg="http://schemas.microsoft.com/office/word/2010/wordprocessingGroup" xmlns:wpi="http://schemas.microsoft.com/office/word/2010/wordprocessingInk" xmlns:wne="http://schemas.microsoft.com/office/word/2006/wordml" xmlns:wps="http://schemas.microsoft.com/office/word/2010/wordprocessingShape" mc:Ignorable="w14 w15 w16se w16cid w16 w16cex w16sdtdh w16sdtfl w16du wp14">
-  <w:p>
-    <w:pPr>
-      <w:pStyle w:val="Footer"/>
-    </w:pPr>
-  </w:p>
-</w:ftr>
-</file>
-
-<file path=word/footer4.xml><?xml version="1.0" encoding="utf-8"?>
+<file path=word/footer2.xml><?xml version="1.0" encoding="utf-8"?>
 <w:ftr xmlns:wpc="http://schemas.microsoft.com/office/word/2010/wordprocessingCanvas" xmlns:cx="http://schemas.microsoft.com/office/drawing/2014/chartex" xmlns:cx1="http://schemas.microsoft.com/office/drawing/2015/9/8/chartex" xmlns:cx2="http://schemas.microsoft.com/office/drawing/2015/10/21/chartex" xmlns:cx3="http://schemas.microsoft.com/office/drawing/2016/5/9/chartex" xmlns:cx4="http://schemas.microsoft.com/office/drawing/2016/5/10/chartex" xmlns:cx5="http://schemas.microsoft.com/office/drawing/2016/5/11/chartex" xmlns:cx6="http://schemas.microsoft.com/office/drawing/2016/5/12/chartex" xmlns:cx7="http://schemas.microsoft.com/office/drawing/2016/5/13/chartex" xmlns:cx8="http://schemas.microsoft.com/office/drawing/2016/5/14/chartex" xmlns:mc="http://schemas.openxmlformats.org/markup-compatibility/2006" xmlns:aink="http://schemas.microsoft.com/office/drawing/2016/ink" xmlns:am3d="http://schemas.microsoft.com/office/drawing/2017/model3d" xmlns:o="urn:schemas-microsoft-com:office:office" xmlns:oel="http://schemas.microsoft.com/office/2019/extlst" xmlns:r="http://schemas.openxmlformats.org/officeDocument/2006/relationships" xmlns:m="http://schemas.openxmlformats.org/officeDocument/2006/math" xmlns:v="urn:schemas-microsoft-com:vml" xmlns:wp14="http://schemas.microsoft.com/office/word/2010/wordprocessingDrawing" xmlns:wp="http://schemas.openxmlformats.org/drawingml/2006/wordprocessingDrawing" xmlns:w10="urn:schemas-microsoft-com:office:word" xmlns:w="http://schemas.openxmlformats.org/wordprocessingml/2006/main" xmlns:w14="http://schemas.microsoft.com/office/word/2010/wordml" xmlns:w15="http://schemas.microsoft.com/office/word/2012/wordml" xmlns:w16cex="http://schemas.microsoft.com/office/word/2018/wordml/cex" xmlns:w16cid="http://schemas.microsoft.com/office/word/2016/wordml/cid" xmlns:w16="http://schemas.microsoft.com/office/word/2018/wordml" xmlns:w16du="http://schemas.microsoft.com/office/word/2023/wordml/word16du" xmlns:w16sdtdh="http://schemas.microsoft.com/office/word/2020/wordml/sdtdatahash" xmlns:w16sdtfl="http://schemas.microsoft.com/office/word/2024/wordml/sdtformatlock" xmlns:w16se="http://schemas.microsoft.com/office/word/2015/wordml/symex" xmlns:wpg="http://schemas.microsoft.com/office/word/2010/wordprocessingGroup" xmlns:wpi="http://schemas.microsoft.com/office/word/2010/wordprocessingInk" xmlns:wne="http://schemas.microsoft.com/office/word/2006/wordml" xmlns:wps="http://schemas.microsoft.com/office/word/2010/wordprocessingShape" mc:Ignorable="w14 w15 w16se w16cid w16 w16cex w16sdtdh w16sdtfl w16du wp14">
   <w:p>
     <w:pPr>
@@ -5671,16 +6272,6 @@
 <w:hdr xmlns:wpc="http://schemas.microsoft.com/office/word/2010/wordprocessingCanvas" xmlns:cx="http://schemas.microsoft.com/office/drawing/2014/chartex" xmlns:cx1="http://schemas.microsoft.com/office/drawing/2015/9/8/chartex" xmlns:cx2="http://schemas.microsoft.com/office/drawing/2015/10/21/chartex" xmlns:cx3="http://schemas.microsoft.com/office/drawing/2016/5/9/chartex" xmlns:cx4="http://schemas.microsoft.com/office/drawing/2016/5/10/chartex" xmlns:cx5="http://schemas.microsoft.com/office/drawing/2016/5/11/chartex" xmlns:cx6="http://schemas.microsoft.com/office/drawing/2016/5/12/chartex" xmlns:cx7="http://schemas.microsoft.com/office/drawing/2016/5/13/chartex" xmlns:cx8="http://schemas.microsoft.com/office/drawing/2016/5/14/chartex" xmlns:mc="http://schemas.openxmlformats.org/markup-compatibility/2006" xmlns:aink="http://schemas.microsoft.com/office/drawing/2016/ink" xmlns:am3d="http://schemas.microsoft.com/office/drawing/2017/model3d" xmlns:o="urn:schemas-microsoft-com:office:office" xmlns:oel="http://schemas.microsoft.com/office/2019/extlst" xmlns:r="http://schemas.openxmlformats.org/officeDocument/2006/relationships" xmlns:m="http://schemas.openxmlformats.org/officeDocument/2006/math" xmlns:v="urn:schemas-microsoft-com:vml" xmlns:wp14="http://schemas.microsoft.com/office/word/2010/wordprocessingDrawing" xmlns:wp="http://schemas.openxmlformats.org/drawingml/2006/wordprocessingDrawing" xmlns:w10="urn:schemas-microsoft-com:office:word" xmlns:w="http://schemas.openxmlformats.org/wordprocessingml/2006/main" xmlns:w14="http://schemas.microsoft.com/office/word/2010/wordml" xmlns:w15="http://schemas.microsoft.com/office/word/2012/wordml" xmlns:w16cex="http://schemas.microsoft.com/office/word/2018/wordml/cex" xmlns:w16cid="http://schemas.microsoft.com/office/word/2016/wordml/cid" xmlns:w16="http://schemas.microsoft.com/office/word/2018/wordml" xmlns:w16du="http://schemas.microsoft.com/office/word/2023/wordml/word16du" xmlns:w16sdtdh="http://schemas.microsoft.com/office/word/2020/wordml/sdtdatahash" xmlns:w16sdtfl="http://schemas.microsoft.com/office/word/2024/wordml/sdtformatlock" xmlns:w16se="http://schemas.microsoft.com/office/word/2015/wordml/symex" xmlns:wpg="http://schemas.microsoft.com/office/word/2010/wordprocessingGroup" xmlns:wpi="http://schemas.microsoft.com/office/word/2010/wordprocessingInk" xmlns:wne="http://schemas.microsoft.com/office/word/2006/wordml" xmlns:wps="http://schemas.microsoft.com/office/word/2010/wordprocessingShape" mc:Ignorable="w14 w15 w16se w16cid w16 w16cex w16sdtdh w16sdtfl w16du wp14">
   <w:p>
     <w:pPr>
-      <w:pStyle w:val="Header"/>
-    </w:pPr>
-  </w:p>
-</w:hdr>
-</file>
-
-<file path=word/header2.xml><?xml version="1.0" encoding="utf-8"?>
-<w:hdr xmlns:wpc="http://schemas.microsoft.com/office/word/2010/wordprocessingCanvas" xmlns:cx="http://schemas.microsoft.com/office/drawing/2014/chartex" xmlns:cx1="http://schemas.microsoft.com/office/drawing/2015/9/8/chartex" xmlns:cx2="http://schemas.microsoft.com/office/drawing/2015/10/21/chartex" xmlns:cx3="http://schemas.microsoft.com/office/drawing/2016/5/9/chartex" xmlns:cx4="http://schemas.microsoft.com/office/drawing/2016/5/10/chartex" xmlns:cx5="http://schemas.microsoft.com/office/drawing/2016/5/11/chartex" xmlns:cx6="http://schemas.microsoft.com/office/drawing/2016/5/12/chartex" xmlns:cx7="http://schemas.microsoft.com/office/drawing/2016/5/13/chartex" xmlns:cx8="http://schemas.microsoft.com/office/drawing/2016/5/14/chartex" xmlns:mc="http://schemas.openxmlformats.org/markup-compatibility/2006" xmlns:aink="http://schemas.microsoft.com/office/drawing/2016/ink" xmlns:am3d="http://schemas.microsoft.com/office/drawing/2017/model3d" xmlns:o="urn:schemas-microsoft-com:office:office" xmlns:oel="http://schemas.microsoft.com/office/2019/extlst" xmlns:r="http://schemas.openxmlformats.org/officeDocument/2006/relationships" xmlns:m="http://schemas.openxmlformats.org/officeDocument/2006/math" xmlns:v="urn:schemas-microsoft-com:vml" xmlns:wp14="http://schemas.microsoft.com/office/word/2010/wordprocessingDrawing" xmlns:wp="http://schemas.openxmlformats.org/drawingml/2006/wordprocessingDrawing" xmlns:w10="urn:schemas-microsoft-com:office:word" xmlns:w="http://schemas.openxmlformats.org/wordprocessingml/2006/main" xmlns:w14="http://schemas.microsoft.com/office/word/2010/wordml" xmlns:w15="http://schemas.microsoft.com/office/word/2012/wordml" xmlns:w16cex="http://schemas.microsoft.com/office/word/2018/wordml/cex" xmlns:w16cid="http://schemas.microsoft.com/office/word/2016/wordml/cid" xmlns:w16="http://schemas.microsoft.com/office/word/2018/wordml" xmlns:w16du="http://schemas.microsoft.com/office/word/2023/wordml/word16du" xmlns:w16sdtdh="http://schemas.microsoft.com/office/word/2020/wordml/sdtdatahash" xmlns:w16sdtfl="http://schemas.microsoft.com/office/word/2024/wordml/sdtformatlock" xmlns:w16se="http://schemas.microsoft.com/office/word/2015/wordml/symex" xmlns:wpg="http://schemas.microsoft.com/office/word/2010/wordprocessingGroup" xmlns:wpi="http://schemas.microsoft.com/office/word/2010/wordprocessingInk" xmlns:wne="http://schemas.microsoft.com/office/word/2006/wordml" xmlns:wps="http://schemas.microsoft.com/office/word/2010/wordprocessingShape" mc:Ignorable="w14 w15 w16se w16cid w16 w16cex w16sdtdh w16sdtfl w16du wp14">
-  <w:p>
-    <w:pPr>
       <w:pBdr>
         <w:bottom w:val="single" w:sz="4" w:space="2" w:color="000000"/>
       </w:pBdr>
@@ -5726,17 +6317,7 @@
 </w:hdr>
 </file>
 
-<file path=word/header3.xml><?xml version="1.0" encoding="utf-8"?>
-<w:hdr xmlns:wpc="http://schemas.microsoft.com/office/word/2010/wordprocessingCanvas" xmlns:cx="http://schemas.microsoft.com/office/drawing/2014/chartex" xmlns:cx1="http://schemas.microsoft.com/office/drawing/2015/9/8/chartex" xmlns:cx2="http://schemas.microsoft.com/office/drawing/2015/10/21/chartex" xmlns:cx3="http://schemas.microsoft.com/office/drawing/2016/5/9/chartex" xmlns:cx4="http://schemas.microsoft.com/office/drawing/2016/5/10/chartex" xmlns:cx5="http://schemas.microsoft.com/office/drawing/2016/5/11/chartex" xmlns:cx6="http://schemas.microsoft.com/office/drawing/2016/5/12/chartex" xmlns:cx7="http://schemas.microsoft.com/office/drawing/2016/5/13/chartex" xmlns:cx8="http://schemas.microsoft.com/office/drawing/2016/5/14/chartex" xmlns:mc="http://schemas.openxmlformats.org/markup-compatibility/2006" xmlns:aink="http://schemas.microsoft.com/office/drawing/2016/ink" xmlns:am3d="http://schemas.microsoft.com/office/drawing/2017/model3d" xmlns:o="urn:schemas-microsoft-com:office:office" xmlns:oel="http://schemas.microsoft.com/office/2019/extlst" xmlns:r="http://schemas.openxmlformats.org/officeDocument/2006/relationships" xmlns:m="http://schemas.openxmlformats.org/officeDocument/2006/math" xmlns:v="urn:schemas-microsoft-com:vml" xmlns:wp14="http://schemas.microsoft.com/office/word/2010/wordprocessingDrawing" xmlns:wp="http://schemas.openxmlformats.org/drawingml/2006/wordprocessingDrawing" xmlns:w10="urn:schemas-microsoft-com:office:word" xmlns:w="http://schemas.openxmlformats.org/wordprocessingml/2006/main" xmlns:w14="http://schemas.microsoft.com/office/word/2010/wordml" xmlns:w15="http://schemas.microsoft.com/office/word/2012/wordml" xmlns:w16cex="http://schemas.microsoft.com/office/word/2018/wordml/cex" xmlns:w16cid="http://schemas.microsoft.com/office/word/2016/wordml/cid" xmlns:w16="http://schemas.microsoft.com/office/word/2018/wordml" xmlns:w16du="http://schemas.microsoft.com/office/word/2023/wordml/word16du" xmlns:w16sdtdh="http://schemas.microsoft.com/office/word/2020/wordml/sdtdatahash" xmlns:w16sdtfl="http://schemas.microsoft.com/office/word/2024/wordml/sdtformatlock" xmlns:w16se="http://schemas.microsoft.com/office/word/2015/wordml/symex" xmlns:wpg="http://schemas.microsoft.com/office/word/2010/wordprocessingGroup" xmlns:wpi="http://schemas.microsoft.com/office/word/2010/wordprocessingInk" xmlns:wne="http://schemas.microsoft.com/office/word/2006/wordml" xmlns:wps="http://schemas.microsoft.com/office/word/2010/wordprocessingShape" mc:Ignorable="w14 w15 w16se w16cid w16 w16cex w16sdtdh w16sdtfl w16du wp14">
-  <w:p>
-    <w:pPr>
-      <w:pStyle w:val="Header"/>
-    </w:pPr>
-  </w:p>
-</w:hdr>
-</file>
-
-<file path=word/header4.xml><?xml version="1.0" encoding="utf-8"?>
+<file path=word/header2.xml><?xml version="1.0" encoding="utf-8"?>
 <w:hdr xmlns:wpc="http://schemas.microsoft.com/office/word/2010/wordprocessingCanvas" xmlns:cx="http://schemas.microsoft.com/office/drawing/2014/chartex" xmlns:cx1="http://schemas.microsoft.com/office/drawing/2015/9/8/chartex" xmlns:cx2="http://schemas.microsoft.com/office/drawing/2015/10/21/chartex" xmlns:cx3="http://schemas.microsoft.com/office/drawing/2016/5/9/chartex" xmlns:cx4="http://schemas.microsoft.com/office/drawing/2016/5/10/chartex" xmlns:cx5="http://schemas.microsoft.com/office/drawing/2016/5/11/chartex" xmlns:cx6="http://schemas.microsoft.com/office/drawing/2016/5/12/chartex" xmlns:cx7="http://schemas.microsoft.com/office/drawing/2016/5/13/chartex" xmlns:cx8="http://schemas.microsoft.com/office/drawing/2016/5/14/chartex" xmlns:mc="http://schemas.openxmlformats.org/markup-compatibility/2006" xmlns:aink="http://schemas.microsoft.com/office/drawing/2016/ink" xmlns:am3d="http://schemas.microsoft.com/office/drawing/2017/model3d" xmlns:o="urn:schemas-microsoft-com:office:office" xmlns:oel="http://schemas.microsoft.com/office/2019/extlst" xmlns:r="http://schemas.openxmlformats.org/officeDocument/2006/relationships" xmlns:m="http://schemas.openxmlformats.org/officeDocument/2006/math" xmlns:v="urn:schemas-microsoft-com:vml" xmlns:wp14="http://schemas.microsoft.com/office/word/2010/wordprocessingDrawing" xmlns:wp="http://schemas.openxmlformats.org/drawingml/2006/wordprocessingDrawing" xmlns:w10="urn:schemas-microsoft-com:office:word" xmlns:w="http://schemas.openxmlformats.org/wordprocessingml/2006/main" xmlns:w14="http://schemas.microsoft.com/office/word/2010/wordml" xmlns:w15="http://schemas.microsoft.com/office/word/2012/wordml" xmlns:w16cex="http://schemas.microsoft.com/office/word/2018/wordml/cex" xmlns:w16cid="http://schemas.microsoft.com/office/word/2016/wordml/cid" xmlns:w16="http://schemas.microsoft.com/office/word/2018/wordml" xmlns:w16du="http://schemas.microsoft.com/office/word/2023/wordml/word16du" xmlns:w16sdtdh="http://schemas.microsoft.com/office/word/2020/wordml/sdtdatahash" xmlns:w16sdtfl="http://schemas.microsoft.com/office/word/2024/wordml/sdtformatlock" xmlns:w16se="http://schemas.microsoft.com/office/word/2015/wordml/symex" xmlns:wpg="http://schemas.microsoft.com/office/word/2010/wordprocessingGroup" xmlns:wpi="http://schemas.microsoft.com/office/word/2010/wordprocessingInk" xmlns:wne="http://schemas.microsoft.com/office/word/2006/wordml" xmlns:wps="http://schemas.microsoft.com/office/word/2010/wordprocessingShape" mc:Ignorable="w14 w15 w16se w16cid w16 w16cex w16sdtdh w16sdtfl w16du wp14">
   <w:p>
     <w:pPr>

</xml_diff>